<commit_message>
Update the calibration sheet
</commit_message>
<xml_diff>
--- a/utils/A4_calibration_sheet.docx
+++ b/utils/A4_calibration_sheet.docx
@@ -19,7 +19,7 @@
         <mc:AlternateContent>
           <mc:Choice Requires="wps">
             <w:drawing>
-              <wp:anchor distT="0" distB="0" distL="114300" distR="114300" simplePos="0" relativeHeight="251675648" behindDoc="0" locked="0" layoutInCell="1" allowOverlap="1" wp14:anchorId="27537A1F" wp14:editId="56051DF6">
+              <wp:anchor distT="0" distB="0" distL="114300" distR="114300" simplePos="0" relativeHeight="251675648" behindDoc="0" locked="0" layoutInCell="1" allowOverlap="1" wp14:anchorId="27537A1F" wp14:editId="21C4DF10">
                 <wp:simplePos x="0" y="0"/>
                 <wp:positionH relativeFrom="column">
                   <wp:posOffset>3395980</wp:posOffset>
@@ -71,7 +71,7 @@
           </mc:Choice>
           <mc:Fallback>
             <w:pict>
-              <v:shapetype w14:anchorId="07152CD3" id="_x0000_t32" coordsize="21600,21600" o:spt="32" o:oned="t" path="m,l21600,21600e" filled="f">
+              <v:shapetype w14:anchorId="6EF68304" id="_x0000_t32" coordsize="21600,21600" o:spt="32" o:oned="t" path="m,l21600,21600e" filled="f">
                 <v:path arrowok="t" fillok="f" o:connecttype="none"/>
                 <o:lock v:ext="edit" shapetype="t"/>
               </v:shapetype>
@@ -346,7 +346,7 @@
         <mc:AlternateContent>
           <mc:Choice Requires="wps">
             <w:drawing>
-              <wp:anchor distT="45720" distB="45720" distL="114300" distR="114300" simplePos="0" relativeHeight="251663360" behindDoc="0" locked="0" layoutInCell="1" allowOverlap="1" wp14:anchorId="07D9C6F5" wp14:editId="6BCA47F6">
+              <wp:anchor distT="45720" distB="45720" distL="114300" distR="114300" simplePos="0" relativeHeight="251663360" behindDoc="0" locked="0" layoutInCell="1" allowOverlap="1" wp14:anchorId="07D9C6F5" wp14:editId="02888F7E">
                 <wp:simplePos x="0" y="0"/>
                 <wp:positionH relativeFrom="column">
                   <wp:posOffset>4672330</wp:posOffset>
@@ -401,23 +401,7 @@
                                 <w:bCs/>
                                 <w:lang w:val="en-US"/>
                               </w:rPr>
-                              <w:t xml:space="preserve">(0, </w:t>
-                            </w:r>
-                            <w:r>
-                              <w:rPr>
-                                <w:b/>
-                                <w:bCs/>
-                                <w:lang w:val="en-US"/>
-                              </w:rPr>
-                              <w:t>13</w:t>
-                            </w:r>
-                            <w:r>
-                              <w:rPr>
-                                <w:b/>
-                                <w:bCs/>
-                                <w:lang w:val="en-US"/>
-                              </w:rPr>
-                              <w:t>0)</w:t>
+                              <w:t>(0, 130)</w:t>
                             </w:r>
                           </w:p>
                           <w:p>
@@ -434,15 +418,7 @@
                                 <w:bCs/>
                                 <w:lang w:val="en-US"/>
                               </w:rPr>
-                              <w:t>ID: 1</w:t>
-                            </w:r>
-                            <w:r>
-                              <w:rPr>
-                                <w:b/>
-                                <w:bCs/>
-                                <w:lang w:val="en-US"/>
-                              </w:rPr>
-                              <w:t>6</w:t>
+                              <w:t>ID: 16</w:t>
                             </w:r>
                           </w:p>
                         </w:txbxContent>
@@ -464,7 +440,11 @@
           </mc:Choice>
           <mc:Fallback>
             <w:pict>
-              <v:shape w14:anchorId="07D9C6F5" id="_x0000_s1027" type="#_x0000_t202" style="position:absolute;margin-left:367.9pt;margin-top:.6pt;width:1in;height:54pt;z-index:251663360;visibility:visible;mso-wrap-style:square;mso-width-percent:0;mso-height-percent:0;mso-wrap-distance-left:9pt;mso-wrap-distance-top:3.6pt;mso-wrap-distance-right:9pt;mso-wrap-distance-bottom:3.6pt;mso-position-horizontal:absolute;mso-position-horizontal-relative:text;mso-position-vertical:absolute;mso-position-vertical-relative:text;mso-width-percent:0;mso-height-percent:0;mso-width-relative:margin;mso-height-relative:margin;v-text-anchor:top" o:gfxdata="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" stroked="f">
+              <v:shapetype w14:anchorId="07D9C6F5" id="_x0000_t202" coordsize="21600,21600" o:spt="202" path="m,l,21600r21600,l21600,xe">
+                <v:stroke joinstyle="miter"/>
+                <v:path gradientshapeok="t" o:connecttype="rect"/>
+              </v:shapetype>
+              <v:shape id="_x0000_s1027" type="#_x0000_t202" style="position:absolute;margin-left:367.9pt;margin-top:.6pt;width:1in;height:54pt;z-index:251663360;visibility:visible;mso-wrap-style:square;mso-width-percent:0;mso-height-percent:0;mso-wrap-distance-left:9pt;mso-wrap-distance-top:3.6pt;mso-wrap-distance-right:9pt;mso-wrap-distance-bottom:3.6pt;mso-position-horizontal:absolute;mso-position-horizontal-relative:text;mso-position-vertical:absolute;mso-position-vertical-relative:text;mso-width-percent:0;mso-height-percent:0;mso-width-relative:margin;mso-height-relative:margin;v-text-anchor:top" o:gfxdata="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" stroked="f">
                 <v:textbox>
                   <w:txbxContent>
                     <w:p>
@@ -481,23 +461,7 @@
                           <w:bCs/>
                           <w:lang w:val="en-US"/>
                         </w:rPr>
-                        <w:t xml:space="preserve">(0, </w:t>
-                      </w:r>
-                      <w:r>
-                        <w:rPr>
-                          <w:b/>
-                          <w:bCs/>
-                          <w:lang w:val="en-US"/>
-                        </w:rPr>
-                        <w:t>13</w:t>
-                      </w:r>
-                      <w:r>
-                        <w:rPr>
-                          <w:b/>
-                          <w:bCs/>
-                          <w:lang w:val="en-US"/>
-                        </w:rPr>
-                        <w:t>0)</w:t>
+                        <w:t>(0, 130)</w:t>
                       </w:r>
                     </w:p>
                     <w:p>
@@ -514,15 +478,7 @@
                           <w:bCs/>
                           <w:lang w:val="en-US"/>
                         </w:rPr>
-                        <w:t>ID: 1</w:t>
-                      </w:r>
-                      <w:r>
-                        <w:rPr>
-                          <w:b/>
-                          <w:bCs/>
-                          <w:lang w:val="en-US"/>
-                        </w:rPr>
-                        <w:t>6</w:t>
+                        <w:t>ID: 16</w:t>
                       </w:r>
                     </w:p>
                   </w:txbxContent>
@@ -708,7 +664,7 @@
         <mc:AlternateContent>
           <mc:Choice Requires="wps">
             <w:drawing>
-              <wp:anchor distT="45720" distB="45720" distL="114300" distR="114300" simplePos="0" relativeHeight="251677696" behindDoc="0" locked="0" layoutInCell="1" allowOverlap="1" wp14:anchorId="12E05959" wp14:editId="3FA6836D">
+              <wp:anchor distT="45720" distB="45720" distL="114300" distR="114300" simplePos="0" relativeHeight="251677696" behindDoc="0" locked="0" layoutInCell="1" allowOverlap="1" wp14:anchorId="12E05959" wp14:editId="461B8E22">
                 <wp:simplePos x="0" y="0"/>
                 <wp:positionH relativeFrom="column">
                   <wp:posOffset>1899920</wp:posOffset>
@@ -752,7 +708,13 @@
                               <w:rPr>
                                 <w:lang w:val="en-US"/>
                               </w:rPr>
-                              <w:t>Robot axis X</w:t>
+                              <w:t xml:space="preserve">Robot axis </w:t>
+                            </w:r>
+                            <w:r>
+                              <w:rPr>
+                                <w:lang w:val="en-US"/>
+                              </w:rPr>
+                              <w:t>Y</w:t>
                             </w:r>
                           </w:p>
                         </w:txbxContent>
@@ -782,7 +744,13 @@
                         <w:rPr>
                           <w:lang w:val="en-US"/>
                         </w:rPr>
-                        <w:t>Robot axis X</w:t>
+                        <w:t xml:space="preserve">Robot axis </w:t>
+                      </w:r>
+                      <w:r>
+                        <w:rPr>
+                          <w:lang w:val="en-US"/>
+                        </w:rPr>
+                        <w:t>Y</w:t>
                       </w:r>
                     </w:p>
                   </w:txbxContent>
@@ -861,13 +829,13 @@
                               <w:rPr>
                                 <w:lang w:val="en-US"/>
                               </w:rPr>
-                              <w:t>Robot axis</w:t>
+                              <w:t xml:space="preserve">Robot axis </w:t>
                             </w:r>
                             <w:r>
                               <w:rPr>
                                 <w:lang w:val="en-US"/>
                               </w:rPr>
-                              <w:t xml:space="preserve"> Y</w:t>
+                              <w:t>X</w:t>
                             </w:r>
                           </w:p>
                         </w:txbxContent>
@@ -897,13 +865,13 @@
                         <w:rPr>
                           <w:lang w:val="en-US"/>
                         </w:rPr>
-                        <w:t>Robot axis</w:t>
-                      </w:r>
-                      <w:r>
-                        <w:rPr>
-                          <w:lang w:val="en-US"/>
-                        </w:rPr>
-                        <w:t xml:space="preserve"> Y</w:t>
+                        <w:t xml:space="preserve">Robot axis </w:t>
+                      </w:r>
+                      <w:r>
+                        <w:rPr>
+                          <w:lang w:val="en-US"/>
+                        </w:rPr>
+                        <w:t>X</w:t>
                       </w:r>
                     </w:p>
                   </w:txbxContent>
@@ -1066,7 +1034,7 @@
         <mc:AlternateContent>
           <mc:Choice Requires="wps">
             <w:drawing>
-              <wp:anchor distT="45720" distB="45720" distL="114300" distR="114300" simplePos="0" relativeHeight="251669504" behindDoc="0" locked="0" layoutInCell="1" allowOverlap="1" wp14:anchorId="6EA04A84" wp14:editId="1AB8DD1D">
+              <wp:anchor distT="45720" distB="45720" distL="114300" distR="114300" simplePos="0" relativeHeight="251669504" behindDoc="0" locked="0" layoutInCell="1" allowOverlap="1" wp14:anchorId="6EA04A84" wp14:editId="4E952673">
                 <wp:simplePos x="0" y="0"/>
                 <wp:positionH relativeFrom="margin">
                   <wp:align>right</wp:align>
@@ -1207,7 +1175,7 @@
         <mc:AlternateContent>
           <mc:Choice Requires="wps">
             <w:drawing>
-              <wp:anchor distT="45720" distB="45720" distL="114300" distR="114300" simplePos="0" relativeHeight="251681792" behindDoc="0" locked="0" layoutInCell="1" allowOverlap="1" wp14:anchorId="2F9B6531" wp14:editId="021308ED">
+              <wp:anchor distT="45720" distB="45720" distL="114300" distR="114300" simplePos="0" relativeHeight="251681792" behindDoc="0" locked="0" layoutInCell="1" allowOverlap="1" wp14:anchorId="2F9B6531" wp14:editId="7CD6FC09">
                 <wp:simplePos x="0" y="0"/>
                 <wp:positionH relativeFrom="margin">
                   <wp:posOffset>1652270</wp:posOffset>
@@ -1251,13 +1219,7 @@
                               <w:rPr>
                                 <w:lang w:val="en-US"/>
                               </w:rPr>
-                              <w:t xml:space="preserve">Robot axis </w:t>
-                            </w:r>
-                            <w:r>
-                              <w:rPr>
-                                <w:lang w:val="en-US"/>
-                              </w:rPr>
-                              <w:t>Z points up</w:t>
+                              <w:t>Robot axis Z points up</w:t>
                             </w:r>
                           </w:p>
                         </w:txbxContent>
@@ -1287,13 +1249,7 @@
                         <w:rPr>
                           <w:lang w:val="en-US"/>
                         </w:rPr>
-                        <w:t xml:space="preserve">Robot axis </w:t>
-                      </w:r>
-                      <w:r>
-                        <w:rPr>
-                          <w:lang w:val="en-US"/>
-                        </w:rPr>
-                        <w:t>Z points up</w:t>
+                        <w:t>Robot axis Z points up</w:t>
                       </w:r>
                     </w:p>
                   </w:txbxContent>
@@ -1322,7 +1278,7 @@
         <mc:AlternateContent>
           <mc:Choice Requires="wps">
             <w:drawing>
-              <wp:anchor distT="0" distB="0" distL="114300" distR="114300" simplePos="0" relativeHeight="251672576" behindDoc="0" locked="0" layoutInCell="1" allowOverlap="1" wp14:anchorId="51D46F39" wp14:editId="46AAE3F3">
+              <wp:anchor distT="0" distB="0" distL="114300" distR="114300" simplePos="0" relativeHeight="251672576" behindDoc="0" locked="0" layoutInCell="1" allowOverlap="1" wp14:anchorId="51D46F39" wp14:editId="2803457C">
                 <wp:simplePos x="0" y="0"/>
                 <wp:positionH relativeFrom="column">
                   <wp:posOffset>4472305</wp:posOffset>
@@ -1374,7 +1330,7 @@
           </mc:Choice>
           <mc:Fallback>
             <w:pict>
-              <v:shape w14:anchorId="080A38B6" id="Straight Arrow Connector 6" o:spid="_x0000_s1026" type="#_x0000_t32" style="position:absolute;margin-left:352.15pt;margin-top:4.3pt;width:82.5pt;height:0;z-index:251672576;visibility:visible;mso-wrap-style:square;mso-wrap-distance-left:9pt;mso-wrap-distance-top:0;mso-wrap-distance-right:9pt;mso-wrap-distance-bottom:0;mso-position-horizontal:absolute;mso-position-horizontal-relative:text;mso-position-vertical:absolute;mso-position-vertical-relative:text" o:gfxdata="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" strokecolor="#156082 [3204]" strokeweight="1.5pt">
+              <v:shape w14:anchorId="11B96EB0" id="Straight Arrow Connector 6" o:spid="_x0000_s1026" type="#_x0000_t32" style="position:absolute;margin-left:352.15pt;margin-top:4.3pt;width:82.5pt;height:0;z-index:251672576;visibility:visible;mso-wrap-style:square;mso-wrap-distance-left:9pt;mso-wrap-distance-top:0;mso-wrap-distance-right:9pt;mso-wrap-distance-bottom:0;mso-position-horizontal:absolute;mso-position-horizontal-relative:text;mso-position-vertical:absolute;mso-position-vertical-relative:text" o:gfxdata="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" strokecolor="#156082 [3204]" strokeweight="1.5pt">
                 <v:stroke endarrow="block" joinstyle="miter"/>
               </v:shape>
             </w:pict>
@@ -1411,26 +1367,6 @@
           <w:lang w:val="en-US"/>
         </w:rPr>
       </w:pPr>
-    </w:p>
-    <w:p>
-      <w:pPr>
-        <w:tabs>
-          <w:tab w:val="left" w:pos="7371"/>
-        </w:tabs>
-        <w:rPr>
-          <w:lang w:val="en-US"/>
-        </w:rPr>
-      </w:pPr>
-    </w:p>
-    <w:p>
-      <w:pPr>
-        <w:tabs>
-          <w:tab w:val="left" w:pos="7371"/>
-        </w:tabs>
-        <w:rPr>
-          <w:lang w:val="en-US"/>
-        </w:rPr>
-      </w:pPr>
       <w:r>
         <w:rPr>
           <w:noProof/>
@@ -1439,16 +1375,16 @@
         <mc:AlternateContent>
           <mc:Choice Requires="wps">
             <w:drawing>
-              <wp:anchor distT="45720" distB="45720" distL="114300" distR="114300" simplePos="0" relativeHeight="251659264" behindDoc="0" locked="0" layoutInCell="1" allowOverlap="1" wp14:anchorId="019B1BD5" wp14:editId="3EDB82D5">
+              <wp:anchor distT="45720" distB="45720" distL="114300" distR="114300" simplePos="0" relativeHeight="251659264" behindDoc="0" locked="0" layoutInCell="1" allowOverlap="1" wp14:anchorId="019B1BD5" wp14:editId="5FA4DD2C">
                 <wp:simplePos x="0" y="0"/>
                 <wp:positionH relativeFrom="column">
-                  <wp:posOffset>1528445</wp:posOffset>
+                  <wp:posOffset>1014730</wp:posOffset>
                 </wp:positionH>
                 <wp:positionV relativeFrom="paragraph">
-                  <wp:posOffset>15240</wp:posOffset>
+                  <wp:posOffset>8255</wp:posOffset>
                 </wp:positionV>
-                <wp:extent cx="2360930" cy="1404620"/>
-                <wp:effectExtent l="0" t="0" r="22860" b="11430"/>
+                <wp:extent cx="3429000" cy="1404620"/>
+                <wp:effectExtent l="0" t="0" r="19050" b="17780"/>
                 <wp:wrapSquare wrapText="bothSides"/>
                 <wp:docPr id="217" name="Text Box 2"/>
                 <wp:cNvGraphicFramePr>
@@ -1463,7 +1399,7 @@
                       <wps:spPr bwMode="auto">
                         <a:xfrm>
                           <a:off x="0" y="0"/>
-                          <a:ext cx="2360930" cy="1404620"/>
+                          <a:ext cx="3429000" cy="1404620"/>
                         </a:xfrm>
                         <a:prstGeom prst="rect">
                           <a:avLst/>
@@ -1492,7 +1428,19 @@
                               <w:rPr>
                                 <w:lang w:val="en-US"/>
                               </w:rPr>
-                              <w:t>Print on A4 Sheet and double check that the distance between the centers of the markers</w:t>
+                              <w:t xml:space="preserve">Print on A4 </w:t>
+                            </w:r>
+                            <w:r>
+                              <w:rPr>
+                                <w:lang w:val="en-US"/>
+                              </w:rPr>
+                              <w:t>s</w:t>
+                            </w:r>
+                            <w:r>
+                              <w:rPr>
+                                <w:lang w:val="en-US"/>
+                              </w:rPr>
+                              <w:t>heet and double check that the distance between the centers of the markers</w:t>
                             </w:r>
                             <w:r>
                               <w:rPr>
@@ -1506,13 +1454,32 @@
                               </w:rPr>
                               <w:t xml:space="preserve"> is 130 mm.</w:t>
                             </w:r>
+                            <w:r>
+                              <w:rPr>
+                                <w:lang w:val="en-US"/>
+                              </w:rPr>
+                              <w:t xml:space="preserve"> </w:t>
+                            </w:r>
+                            <w:r>
+                              <w:rPr>
+                                <w:lang w:val="en-US"/>
+                              </w:rPr>
+                              <w:t>Otherwise, adjust the configuration file.</w:t>
+                            </w:r>
+                          </w:p>
+                          <w:p>
+                            <w:pPr>
+                              <w:rPr>
+                                <w:lang w:val="en-US"/>
+                              </w:rPr>
+                            </w:pPr>
                           </w:p>
                           <w:p>
                             <w:r>
                               <w:rPr>
                                 <w:lang w:val="en-US"/>
                               </w:rPr>
-                              <w:t>Otherwise, adjust the configuration file.</w:t>
+                              <w:t>Align the robot axes with the sheet. Write to the configuration file the robot XY position and Z orientation when the robot gripper is at the center of the marker with ID: 11 (0, 0).</w:t>
                             </w:r>
                           </w:p>
                         </w:txbxContent>
@@ -1524,7 +1491,7 @@
                   </a:graphicData>
                 </a:graphic>
                 <wp14:sizeRelH relativeFrom="margin">
-                  <wp14:pctWidth>40000</wp14:pctWidth>
+                  <wp14:pctWidth>0</wp14:pctWidth>
                 </wp14:sizeRelH>
                 <wp14:sizeRelV relativeFrom="margin">
                   <wp14:pctHeight>20000</wp14:pctHeight>
@@ -1534,7 +1501,7 @@
           </mc:Choice>
           <mc:Fallback>
             <w:pict>
-              <v:shape w14:anchorId="019B1BD5" id="_x0000_s1033" type="#_x0000_t202" style="position:absolute;margin-left:120.35pt;margin-top:1.2pt;width:185.9pt;height:110.6pt;z-index:251659264;visibility:visible;mso-wrap-style:square;mso-width-percent:400;mso-height-percent:200;mso-wrap-distance-left:9pt;mso-wrap-distance-top:3.6pt;mso-wrap-distance-right:9pt;mso-wrap-distance-bottom:3.6pt;mso-position-horizontal:absolute;mso-position-horizontal-relative:text;mso-position-vertical:absolute;mso-position-vertical-relative:text;mso-width-percent:400;mso-height-percent:200;mso-width-relative:margin;mso-height-relative:margin;v-text-anchor:top" o:gfxdata="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">
+              <v:shape w14:anchorId="019B1BD5" id="_x0000_s1033" type="#_x0000_t202" style="position:absolute;margin-left:79.9pt;margin-top:.65pt;width:270pt;height:110.6pt;z-index:251659264;visibility:visible;mso-wrap-style:square;mso-width-percent:0;mso-height-percent:200;mso-wrap-distance-left:9pt;mso-wrap-distance-top:3.6pt;mso-wrap-distance-right:9pt;mso-wrap-distance-bottom:3.6pt;mso-position-horizontal:absolute;mso-position-horizontal-relative:text;mso-position-vertical:absolute;mso-position-vertical-relative:text;mso-width-percent:0;mso-height-percent:200;mso-width-relative:margin;mso-height-relative:margin;v-text-anchor:top" o:gfxdata="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">
                 <v:textbox style="mso-fit-shape-to-text:t">
                   <w:txbxContent>
                     <w:p>
@@ -1547,7 +1514,19 @@
                         <w:rPr>
                           <w:lang w:val="en-US"/>
                         </w:rPr>
-                        <w:t>Print on A4 Sheet and double check that the distance between the centers of the markers</w:t>
+                        <w:t xml:space="preserve">Print on A4 </w:t>
+                      </w:r>
+                      <w:r>
+                        <w:rPr>
+                          <w:lang w:val="en-US"/>
+                        </w:rPr>
+                        <w:t>s</w:t>
+                      </w:r>
+                      <w:r>
+                        <w:rPr>
+                          <w:lang w:val="en-US"/>
+                        </w:rPr>
+                        <w:t>heet and double check that the distance between the centers of the markers</w:t>
                       </w:r>
                       <w:r>
                         <w:rPr>
@@ -1560,14 +1539,33 @@
                           <w:lang w:val="en-US"/>
                         </w:rPr>
                         <w:t xml:space="preserve"> is 130 mm.</w:t>
+                      </w:r>
+                      <w:r>
+                        <w:rPr>
+                          <w:lang w:val="en-US"/>
+                        </w:rPr>
+                        <w:t xml:space="preserve"> </w:t>
+                      </w:r>
+                      <w:r>
+                        <w:rPr>
+                          <w:lang w:val="en-US"/>
+                        </w:rPr>
+                        <w:t>Otherwise, adjust the configuration file.</w:t>
                       </w:r>
                     </w:p>
                     <w:p>
-                      <w:r>
-                        <w:rPr>
-                          <w:lang w:val="en-US"/>
-                        </w:rPr>
-                        <w:t>Otherwise, adjust the configuration file.</w:t>
+                      <w:pPr>
+                        <w:rPr>
+                          <w:lang w:val="en-US"/>
+                        </w:rPr>
+                      </w:pPr>
+                    </w:p>
+                    <w:p>
+                      <w:r>
+                        <w:rPr>
+                          <w:lang w:val="en-US"/>
+                        </w:rPr>
+                        <w:t>Align the robot axes with the sheet. Write to the configuration file the robot XY position and Z orientation when the robot gripper is at the center of the marker with ID: 11 (0, 0).</w:t>
                       </w:r>
                     </w:p>
                   </w:txbxContent>
@@ -1578,6 +1576,26 @@
           </mc:Fallback>
         </mc:AlternateContent>
       </w:r>
+    </w:p>
+    <w:p>
+      <w:pPr>
+        <w:tabs>
+          <w:tab w:val="left" w:pos="7371"/>
+        </w:tabs>
+        <w:rPr>
+          <w:lang w:val="en-US"/>
+        </w:rPr>
+      </w:pPr>
+    </w:p>
+    <w:p>
+      <w:pPr>
+        <w:tabs>
+          <w:tab w:val="left" w:pos="7371"/>
+        </w:tabs>
+        <w:rPr>
+          <w:lang w:val="en-US"/>
+        </w:rPr>
+      </w:pPr>
       <w:r>
         <w:rPr>
           <w:noProof/>
@@ -1641,23 +1659,7 @@
                                 <w:bCs/>
                                 <w:lang w:val="en-US"/>
                               </w:rPr>
-                              <w:t>(</w:t>
-                            </w:r>
-                            <w:r>
-                              <w:rPr>
-                                <w:b/>
-                                <w:bCs/>
-                                <w:lang w:val="en-US"/>
-                              </w:rPr>
-                              <w:t>13</w:t>
-                            </w:r>
-                            <w:r>
-                              <w:rPr>
-                                <w:b/>
-                                <w:bCs/>
-                                <w:lang w:val="en-US"/>
-                              </w:rPr>
-                              <w:t>0, 0)</w:t>
+                              <w:t>(130, 0)</w:t>
                             </w:r>
                           </w:p>
                           <w:p>
@@ -1674,15 +1676,7 @@
                                 <w:bCs/>
                                 <w:lang w:val="en-US"/>
                               </w:rPr>
-                              <w:t>ID: 1</w:t>
-                            </w:r>
-                            <w:r>
-                              <w:rPr>
-                                <w:b/>
-                                <w:bCs/>
-                                <w:lang w:val="en-US"/>
-                              </w:rPr>
-                              <w:t>5</w:t>
+                              <w:t>ID: 15</w:t>
                             </w:r>
                           </w:p>
                         </w:txbxContent>
@@ -1836,23 +1830,7 @@
                                 <w:bCs/>
                                 <w:lang w:val="en-US"/>
                               </w:rPr>
-                              <w:t>(</w:t>
-                            </w:r>
-                            <w:r>
-                              <w:rPr>
-                                <w:b/>
-                                <w:bCs/>
-                                <w:lang w:val="en-US"/>
-                              </w:rPr>
-                              <w:t>13</w:t>
-                            </w:r>
-                            <w:r>
-                              <w:rPr>
-                                <w:b/>
-                                <w:bCs/>
-                                <w:lang w:val="en-US"/>
-                              </w:rPr>
-                              <w:t>0, 0)</w:t>
+                              <w:t>(130, 0)</w:t>
                             </w:r>
                           </w:p>
                           <w:p>
@@ -1869,15 +1847,7 @@
                                 <w:bCs/>
                                 <w:lang w:val="en-US"/>
                               </w:rPr>
-                              <w:t>ID: 1</w:t>
-                            </w:r>
-                            <w:r>
-                              <w:rPr>
-                                <w:b/>
-                                <w:bCs/>
-                                <w:lang w:val="en-US"/>
-                              </w:rPr>
-                              <w:t>0</w:t>
+                              <w:t>ID: 10</w:t>
                             </w:r>
                           </w:p>
                         </w:txbxContent>
@@ -2681,6 +2651,7 @@
   <w:style w:type="character" w:default="1" w:styleId="DefaultParagraphFont">
     <w:name w:val="Default Paragraph Font"/>
     <w:uiPriority w:val="1"/>
+    <w:semiHidden/>
     <w:unhideWhenUsed/>
   </w:style>
   <w:style w:type="table" w:default="1" w:styleId="TableNormal">

</xml_diff>